<commit_message>
Okuma Kitapçığı 1: tren vagonları 2. kitapçıkla aynı büyüklükte (her vagon ayrı sayfa)
Co-Authored-By: Claude Opus 5.5 <noreply@anthropic.com>
Claude-Session: https://claude.ai/code/session_01R3XciSJybYm9zKgksjodWz
</commit_message>
<xml_diff>
--- a/okuma-kitapcigi-1-a-n-e.docx
+++ b/okuma-kitapcigi-1-a-n-e.docx
@@ -4,12 +4,12 @@
   <w:body>
     <w:p>
       <w:pPr>
-        <w:spacing w:before="0" w:after="0" w:line="240" w:lineRule="auto"/>
+        <w:spacing w:before="0" w:after="0"/>
       </w:pPr>
       <w:r>
         <w:drawing>
           <wp:inline xmlns:a="http://schemas.openxmlformats.org/drawingml/2006/main" xmlns:pic="http://schemas.openxmlformats.org/drawingml/2006/picture">
-            <wp:extent cx="7524000" cy="10620000"/>
+            <wp:extent cx="7556400" cy="10684800"/>
             <wp:docPr id="1" name="Picture 1"/>
             <wp:cNvGraphicFramePr>
               <a:graphicFrameLocks noChangeAspect="1"/>
@@ -18,7 +18,7 @@
               <a:graphicData uri="http://schemas.openxmlformats.org/drawingml/2006/picture">
                 <pic:pic>
                   <pic:nvPicPr>
-                    <pic:cNvPr id="0" name="p-01.jpg"/>
+                    <pic:cNvPr id="0" name="w-01.jpg"/>
                     <pic:cNvPicPr/>
                   </pic:nvPicPr>
                   <pic:blipFill>
@@ -30,7 +30,7 @@
                   <pic:spPr>
                     <a:xfrm>
                       <a:off x="0" y="0"/>
-                      <a:ext cx="7524000" cy="10620000"/>
+                      <a:ext cx="7556400" cy="10684800"/>
                     </a:xfrm>
                     <a:prstGeom prst="rect"/>
                   </pic:spPr>
@@ -43,13 +43,12 @@
     </w:p>
     <w:p>
       <w:pPr>
-        <w:pageBreakBefore/>
-        <w:spacing w:before="0" w:after="0" w:line="240" w:lineRule="auto"/>
+        <w:spacing w:before="0" w:after="0"/>
       </w:pPr>
       <w:r>
         <w:drawing>
           <wp:inline xmlns:a="http://schemas.openxmlformats.org/drawingml/2006/main" xmlns:pic="http://schemas.openxmlformats.org/drawingml/2006/picture">
-            <wp:extent cx="7524000" cy="10620000"/>
+            <wp:extent cx="7556400" cy="10684800"/>
             <wp:docPr id="2" name="Picture 2"/>
             <wp:cNvGraphicFramePr>
               <a:graphicFrameLocks noChangeAspect="1"/>
@@ -58,7 +57,7 @@
               <a:graphicData uri="http://schemas.openxmlformats.org/drawingml/2006/picture">
                 <pic:pic>
                   <pic:nvPicPr>
-                    <pic:cNvPr id="0" name="p-02.jpg"/>
+                    <pic:cNvPr id="0" name="w-02.jpg"/>
                     <pic:cNvPicPr/>
                   </pic:nvPicPr>
                   <pic:blipFill>
@@ -70,7 +69,7 @@
                   <pic:spPr>
                     <a:xfrm>
                       <a:off x="0" y="0"/>
-                      <a:ext cx="7524000" cy="10620000"/>
+                      <a:ext cx="7556400" cy="10684800"/>
                     </a:xfrm>
                     <a:prstGeom prst="rect"/>
                   </pic:spPr>
@@ -83,13 +82,12 @@
     </w:p>
     <w:p>
       <w:pPr>
-        <w:pageBreakBefore/>
-        <w:spacing w:before="0" w:after="0" w:line="240" w:lineRule="auto"/>
+        <w:spacing w:before="0" w:after="0"/>
       </w:pPr>
       <w:r>
         <w:drawing>
           <wp:inline xmlns:a="http://schemas.openxmlformats.org/drawingml/2006/main" xmlns:pic="http://schemas.openxmlformats.org/drawingml/2006/picture">
-            <wp:extent cx="7524000" cy="10620000"/>
+            <wp:extent cx="7556400" cy="10684800"/>
             <wp:docPr id="3" name="Picture 3"/>
             <wp:cNvGraphicFramePr>
               <a:graphicFrameLocks noChangeAspect="1"/>
@@ -98,7 +96,7 @@
               <a:graphicData uri="http://schemas.openxmlformats.org/drawingml/2006/picture">
                 <pic:pic>
                   <pic:nvPicPr>
-                    <pic:cNvPr id="0" name="p-03.jpg"/>
+                    <pic:cNvPr id="0" name="w-03.jpg"/>
                     <pic:cNvPicPr/>
                   </pic:nvPicPr>
                   <pic:blipFill>
@@ -110,7 +108,7 @@
                   <pic:spPr>
                     <a:xfrm>
                       <a:off x="0" y="0"/>
-                      <a:ext cx="7524000" cy="10620000"/>
+                      <a:ext cx="7556400" cy="10684800"/>
                     </a:xfrm>
                     <a:prstGeom prst="rect"/>
                   </pic:spPr>
@@ -123,13 +121,12 @@
     </w:p>
     <w:p>
       <w:pPr>
-        <w:pageBreakBefore/>
-        <w:spacing w:before="0" w:after="0" w:line="240" w:lineRule="auto"/>
+        <w:spacing w:before="0" w:after="0"/>
       </w:pPr>
       <w:r>
         <w:drawing>
           <wp:inline xmlns:a="http://schemas.openxmlformats.org/drawingml/2006/main" xmlns:pic="http://schemas.openxmlformats.org/drawingml/2006/picture">
-            <wp:extent cx="7524000" cy="10620000"/>
+            <wp:extent cx="7556400" cy="10684800"/>
             <wp:docPr id="4" name="Picture 4"/>
             <wp:cNvGraphicFramePr>
               <a:graphicFrameLocks noChangeAspect="1"/>
@@ -138,7 +135,7 @@
               <a:graphicData uri="http://schemas.openxmlformats.org/drawingml/2006/picture">
                 <pic:pic>
                   <pic:nvPicPr>
-                    <pic:cNvPr id="0" name="p-04.jpg"/>
+                    <pic:cNvPr id="0" name="w-04.jpg"/>
                     <pic:cNvPicPr/>
                   </pic:nvPicPr>
                   <pic:blipFill>
@@ -150,7 +147,7 @@
                   <pic:spPr>
                     <a:xfrm>
                       <a:off x="0" y="0"/>
-                      <a:ext cx="7524000" cy="10620000"/>
+                      <a:ext cx="7556400" cy="10684800"/>
                     </a:xfrm>
                     <a:prstGeom prst="rect"/>
                   </pic:spPr>
@@ -163,13 +160,12 @@
     </w:p>
     <w:p>
       <w:pPr>
-        <w:pageBreakBefore/>
-        <w:spacing w:before="0" w:after="0" w:line="240" w:lineRule="auto"/>
+        <w:spacing w:before="0" w:after="0"/>
       </w:pPr>
       <w:r>
         <w:drawing>
           <wp:inline xmlns:a="http://schemas.openxmlformats.org/drawingml/2006/main" xmlns:pic="http://schemas.openxmlformats.org/drawingml/2006/picture">
-            <wp:extent cx="7524000" cy="10620000"/>
+            <wp:extent cx="7556400" cy="10684800"/>
             <wp:docPr id="5" name="Picture 5"/>
             <wp:cNvGraphicFramePr>
               <a:graphicFrameLocks noChangeAspect="1"/>
@@ -178,7 +174,7 @@
               <a:graphicData uri="http://schemas.openxmlformats.org/drawingml/2006/picture">
                 <pic:pic>
                   <pic:nvPicPr>
-                    <pic:cNvPr id="0" name="p-05.jpg"/>
+                    <pic:cNvPr id="0" name="w-05.jpg"/>
                     <pic:cNvPicPr/>
                   </pic:nvPicPr>
                   <pic:blipFill>
@@ -190,7 +186,7 @@
                   <pic:spPr>
                     <a:xfrm>
                       <a:off x="0" y="0"/>
-                      <a:ext cx="7524000" cy="10620000"/>
+                      <a:ext cx="7556400" cy="10684800"/>
                     </a:xfrm>
                     <a:prstGeom prst="rect"/>
                   </pic:spPr>
@@ -203,13 +199,12 @@
     </w:p>
     <w:p>
       <w:pPr>
-        <w:pageBreakBefore/>
-        <w:spacing w:before="0" w:after="0" w:line="240" w:lineRule="auto"/>
+        <w:spacing w:before="0" w:after="0"/>
       </w:pPr>
       <w:r>
         <w:drawing>
           <wp:inline xmlns:a="http://schemas.openxmlformats.org/drawingml/2006/main" xmlns:pic="http://schemas.openxmlformats.org/drawingml/2006/picture">
-            <wp:extent cx="7524000" cy="10620000"/>
+            <wp:extent cx="7556400" cy="10684800"/>
             <wp:docPr id="6" name="Picture 6"/>
             <wp:cNvGraphicFramePr>
               <a:graphicFrameLocks noChangeAspect="1"/>
@@ -218,7 +213,7 @@
               <a:graphicData uri="http://schemas.openxmlformats.org/drawingml/2006/picture">
                 <pic:pic>
                   <pic:nvPicPr>
-                    <pic:cNvPr id="0" name="p-06.jpg"/>
+                    <pic:cNvPr id="0" name="w-06.jpg"/>
                     <pic:cNvPicPr/>
                   </pic:nvPicPr>
                   <pic:blipFill>
@@ -230,7 +225,7 @@
                   <pic:spPr>
                     <a:xfrm>
                       <a:off x="0" y="0"/>
-                      <a:ext cx="7524000" cy="10620000"/>
+                      <a:ext cx="7556400" cy="10684800"/>
                     </a:xfrm>
                     <a:prstGeom prst="rect"/>
                   </pic:spPr>
@@ -243,13 +238,12 @@
     </w:p>
     <w:p>
       <w:pPr>
-        <w:pageBreakBefore/>
-        <w:spacing w:before="0" w:after="0" w:line="240" w:lineRule="auto"/>
+        <w:spacing w:before="0" w:after="0"/>
       </w:pPr>
       <w:r>
         <w:drawing>
           <wp:inline xmlns:a="http://schemas.openxmlformats.org/drawingml/2006/main" xmlns:pic="http://schemas.openxmlformats.org/drawingml/2006/picture">
-            <wp:extent cx="7524000" cy="10620000"/>
+            <wp:extent cx="7556400" cy="10684800"/>
             <wp:docPr id="7" name="Picture 7"/>
             <wp:cNvGraphicFramePr>
               <a:graphicFrameLocks noChangeAspect="1"/>
@@ -258,7 +252,7 @@
               <a:graphicData uri="http://schemas.openxmlformats.org/drawingml/2006/picture">
                 <pic:pic>
                   <pic:nvPicPr>
-                    <pic:cNvPr id="0" name="p-07.jpg"/>
+                    <pic:cNvPr id="0" name="w-07.jpg"/>
                     <pic:cNvPicPr/>
                   </pic:nvPicPr>
                   <pic:blipFill>
@@ -270,7 +264,7 @@
                   <pic:spPr>
                     <a:xfrm>
                       <a:off x="0" y="0"/>
-                      <a:ext cx="7524000" cy="10620000"/>
+                      <a:ext cx="7556400" cy="10684800"/>
                     </a:xfrm>
                     <a:prstGeom prst="rect"/>
                   </pic:spPr>
@@ -283,13 +277,12 @@
     </w:p>
     <w:p>
       <w:pPr>
-        <w:pageBreakBefore/>
-        <w:spacing w:before="0" w:after="0" w:line="240" w:lineRule="auto"/>
+        <w:spacing w:before="0" w:after="0"/>
       </w:pPr>
       <w:r>
         <w:drawing>
           <wp:inline xmlns:a="http://schemas.openxmlformats.org/drawingml/2006/main" xmlns:pic="http://schemas.openxmlformats.org/drawingml/2006/picture">
-            <wp:extent cx="7524000" cy="10620000"/>
+            <wp:extent cx="7556400" cy="10684800"/>
             <wp:docPr id="8" name="Picture 8"/>
             <wp:cNvGraphicFramePr>
               <a:graphicFrameLocks noChangeAspect="1"/>
@@ -298,7 +291,7 @@
               <a:graphicData uri="http://schemas.openxmlformats.org/drawingml/2006/picture">
                 <pic:pic>
                   <pic:nvPicPr>
-                    <pic:cNvPr id="0" name="p-08.jpg"/>
+                    <pic:cNvPr id="0" name="w-08.jpg"/>
                     <pic:cNvPicPr/>
                   </pic:nvPicPr>
                   <pic:blipFill>
@@ -310,7 +303,7 @@
                   <pic:spPr>
                     <a:xfrm>
                       <a:off x="0" y="0"/>
-                      <a:ext cx="7524000" cy="10620000"/>
+                      <a:ext cx="7556400" cy="10684800"/>
                     </a:xfrm>
                     <a:prstGeom prst="rect"/>
                   </pic:spPr>
@@ -323,13 +316,12 @@
     </w:p>
     <w:p>
       <w:pPr>
-        <w:pageBreakBefore/>
-        <w:spacing w:before="0" w:after="0" w:line="240" w:lineRule="auto"/>
+        <w:spacing w:before="0" w:after="0"/>
       </w:pPr>
       <w:r>
         <w:drawing>
           <wp:inline xmlns:a="http://schemas.openxmlformats.org/drawingml/2006/main" xmlns:pic="http://schemas.openxmlformats.org/drawingml/2006/picture">
-            <wp:extent cx="7524000" cy="10620000"/>
+            <wp:extent cx="7556400" cy="10684800"/>
             <wp:docPr id="9" name="Picture 9"/>
             <wp:cNvGraphicFramePr>
               <a:graphicFrameLocks noChangeAspect="1"/>
@@ -338,7 +330,7 @@
               <a:graphicData uri="http://schemas.openxmlformats.org/drawingml/2006/picture">
                 <pic:pic>
                   <pic:nvPicPr>
-                    <pic:cNvPr id="0" name="p-09.jpg"/>
+                    <pic:cNvPr id="0" name="w-09.jpg"/>
                     <pic:cNvPicPr/>
                   </pic:nvPicPr>
                   <pic:blipFill>
@@ -350,7 +342,7 @@
                   <pic:spPr>
                     <a:xfrm>
                       <a:off x="0" y="0"/>
-                      <a:ext cx="7524000" cy="10620000"/>
+                      <a:ext cx="7556400" cy="10684800"/>
                     </a:xfrm>
                     <a:prstGeom prst="rect"/>
                   </pic:spPr>
@@ -363,13 +355,12 @@
     </w:p>
     <w:p>
       <w:pPr>
-        <w:pageBreakBefore/>
-        <w:spacing w:before="0" w:after="0" w:line="240" w:lineRule="auto"/>
+        <w:spacing w:before="0" w:after="0"/>
       </w:pPr>
       <w:r>
         <w:drawing>
           <wp:inline xmlns:a="http://schemas.openxmlformats.org/drawingml/2006/main" xmlns:pic="http://schemas.openxmlformats.org/drawingml/2006/picture">
-            <wp:extent cx="7524000" cy="10620000"/>
+            <wp:extent cx="7556400" cy="10684800"/>
             <wp:docPr id="10" name="Picture 10"/>
             <wp:cNvGraphicFramePr>
               <a:graphicFrameLocks noChangeAspect="1"/>
@@ -378,7 +369,7 @@
               <a:graphicData uri="http://schemas.openxmlformats.org/drawingml/2006/picture">
                 <pic:pic>
                   <pic:nvPicPr>
-                    <pic:cNvPr id="0" name="p-10.jpg"/>
+                    <pic:cNvPr id="0" name="w-10.jpg"/>
                     <pic:cNvPicPr/>
                   </pic:nvPicPr>
                   <pic:blipFill>
@@ -390,7 +381,7 @@
                   <pic:spPr>
                     <a:xfrm>
                       <a:off x="0" y="0"/>
-                      <a:ext cx="7524000" cy="10620000"/>
+                      <a:ext cx="7556400" cy="10684800"/>
                     </a:xfrm>
                     <a:prstGeom prst="rect"/>
                   </pic:spPr>
@@ -403,13 +394,12 @@
     </w:p>
     <w:p>
       <w:pPr>
-        <w:pageBreakBefore/>
-        <w:spacing w:before="0" w:after="0" w:line="240" w:lineRule="auto"/>
+        <w:spacing w:before="0" w:after="0"/>
       </w:pPr>
       <w:r>
         <w:drawing>
           <wp:inline xmlns:a="http://schemas.openxmlformats.org/drawingml/2006/main" xmlns:pic="http://schemas.openxmlformats.org/drawingml/2006/picture">
-            <wp:extent cx="7524000" cy="10620000"/>
+            <wp:extent cx="7556400" cy="10684800"/>
             <wp:docPr id="11" name="Picture 11"/>
             <wp:cNvGraphicFramePr>
               <a:graphicFrameLocks noChangeAspect="1"/>
@@ -418,7 +408,7 @@
               <a:graphicData uri="http://schemas.openxmlformats.org/drawingml/2006/picture">
                 <pic:pic>
                   <pic:nvPicPr>
-                    <pic:cNvPr id="0" name="p-11.jpg"/>
+                    <pic:cNvPr id="0" name="w-11.jpg"/>
                     <pic:cNvPicPr/>
                   </pic:nvPicPr>
                   <pic:blipFill>
@@ -430,7 +420,7 @@
                   <pic:spPr>
                     <a:xfrm>
                       <a:off x="0" y="0"/>
-                      <a:ext cx="7524000" cy="10620000"/>
+                      <a:ext cx="7556400" cy="10684800"/>
                     </a:xfrm>
                     <a:prstGeom prst="rect"/>
                   </pic:spPr>
@@ -443,13 +433,12 @@
     </w:p>
     <w:p>
       <w:pPr>
-        <w:pageBreakBefore/>
-        <w:spacing w:before="0" w:after="0" w:line="240" w:lineRule="auto"/>
+        <w:spacing w:before="0" w:after="0"/>
       </w:pPr>
       <w:r>
         <w:drawing>
           <wp:inline xmlns:a="http://schemas.openxmlformats.org/drawingml/2006/main" xmlns:pic="http://schemas.openxmlformats.org/drawingml/2006/picture">
-            <wp:extent cx="7524000" cy="10620000"/>
+            <wp:extent cx="7556400" cy="10684800"/>
             <wp:docPr id="12" name="Picture 12"/>
             <wp:cNvGraphicFramePr>
               <a:graphicFrameLocks noChangeAspect="1"/>
@@ -458,7 +447,7 @@
               <a:graphicData uri="http://schemas.openxmlformats.org/drawingml/2006/picture">
                 <pic:pic>
                   <pic:nvPicPr>
-                    <pic:cNvPr id="0" name="p-12.jpg"/>
+                    <pic:cNvPr id="0" name="w-12.jpg"/>
                     <pic:cNvPicPr/>
                   </pic:nvPicPr>
                   <pic:blipFill>
@@ -470,7 +459,85 @@
                   <pic:spPr>
                     <a:xfrm>
                       <a:off x="0" y="0"/>
-                      <a:ext cx="7524000" cy="10620000"/>
+                      <a:ext cx="7556400" cy="10684800"/>
+                    </a:xfrm>
+                    <a:prstGeom prst="rect"/>
+                  </pic:spPr>
+                </pic:pic>
+              </a:graphicData>
+            </a:graphic>
+          </wp:inline>
+        </w:drawing>
+      </w:r>
+    </w:p>
+    <w:p>
+      <w:pPr>
+        <w:spacing w:before="0" w:after="0"/>
+      </w:pPr>
+      <w:r>
+        <w:drawing>
+          <wp:inline xmlns:a="http://schemas.openxmlformats.org/drawingml/2006/main" xmlns:pic="http://schemas.openxmlformats.org/drawingml/2006/picture">
+            <wp:extent cx="7556400" cy="10684800"/>
+            <wp:docPr id="13" name="Picture 13"/>
+            <wp:cNvGraphicFramePr>
+              <a:graphicFrameLocks noChangeAspect="1"/>
+            </wp:cNvGraphicFramePr>
+            <a:graphic>
+              <a:graphicData uri="http://schemas.openxmlformats.org/drawingml/2006/picture">
+                <pic:pic>
+                  <pic:nvPicPr>
+                    <pic:cNvPr id="0" name="w-13.jpg"/>
+                    <pic:cNvPicPr/>
+                  </pic:nvPicPr>
+                  <pic:blipFill>
+                    <a:blip r:embed="rId21"/>
+                    <a:stretch>
+                      <a:fillRect/>
+                    </a:stretch>
+                  </pic:blipFill>
+                  <pic:spPr>
+                    <a:xfrm>
+                      <a:off x="0" y="0"/>
+                      <a:ext cx="7556400" cy="10684800"/>
+                    </a:xfrm>
+                    <a:prstGeom prst="rect"/>
+                  </pic:spPr>
+                </pic:pic>
+              </a:graphicData>
+            </a:graphic>
+          </wp:inline>
+        </w:drawing>
+      </w:r>
+    </w:p>
+    <w:p>
+      <w:pPr>
+        <w:spacing w:before="0" w:after="0"/>
+      </w:pPr>
+      <w:r>
+        <w:drawing>
+          <wp:inline xmlns:a="http://schemas.openxmlformats.org/drawingml/2006/main" xmlns:pic="http://schemas.openxmlformats.org/drawingml/2006/picture">
+            <wp:extent cx="7556400" cy="10684800"/>
+            <wp:docPr id="14" name="Picture 14"/>
+            <wp:cNvGraphicFramePr>
+              <a:graphicFrameLocks noChangeAspect="1"/>
+            </wp:cNvGraphicFramePr>
+            <a:graphic>
+              <a:graphicData uri="http://schemas.openxmlformats.org/drawingml/2006/picture">
+                <pic:pic>
+                  <pic:nvPicPr>
+                    <pic:cNvPr id="0" name="w-14.jpg"/>
+                    <pic:cNvPicPr/>
+                  </pic:nvPicPr>
+                  <pic:blipFill>
+                    <a:blip r:embed="rId22"/>
+                    <a:stretch>
+                      <a:fillRect/>
+                    </a:stretch>
+                  </pic:blipFill>
+                  <pic:spPr>
+                    <a:xfrm>
+                      <a:off x="0" y="0"/>
+                      <a:ext cx="7556400" cy="10684800"/>
                     </a:xfrm>
                     <a:prstGeom prst="rect"/>
                   </pic:spPr>

</xml_diff>